<commit_message>
Expand Conclusion and rewrite Limitations as prose (v2)
Conclusion grows from ~90 to 330 words across three paragraphs:
restates the research aim and confounders, synthesises the funnel and
validation results, then states the contributions and next steps --
previously it was a single compressed paragraph.

Limitations converted from a five-item bullet list to a single
239-word flowing paragraph ("First... Second... Third... Fourth...
Fifth..."), per author request. Same five points, same substance, no
new claims. Body word count now 4,230 (still within the 3,000-6,000
requirement).
</commit_message>
<xml_diff>
--- a/Manuscrito_LearnedPublishing_v2.docx
+++ b/Manuscrito_LearnedPublishing_v2.docx
@@ -3008,7 +3008,35 @@
           <w:i w:val="0"/>
           <w:sz w:val="22"/>
         </w:rPr>
-        <w:t>On the evidence presented here, fabricated references are a substantially smaller problem than unvalidated detection would suggest. What appears to be fabrication in the citation record is overwhelmingly real scholarship rendered invisible by indexing gaps and by citation matching that fails too readily. A credible screening tool, and a credible prevalence estimate, both depend on distinguishing these populations rather than conflating them. This study provides such a tool, an annotated benchmark, and a taxonomy, and identifies a properly powered, larger-scale prevalence estimate as the natural next step.</w:t>
+        <w:t>This study set out to establish how prevalent fabricated references generated by large language models actually are in the published scholarly literature, and to do so in a way that does not conflate genuine fabrication with the two confounders most likely to inflate a naïve estimate: legitimate scholarship absent from the major bibliographic indexes, and real citations rendered unmatchable by abbreviation or malformation. Applied to 5,000 unresolved reference strings drawn from 2024 journal articles, the four-source verification cascade recovered a quarter of these as real works that standard citation matching had simply failed to link, and identified a further eighth as citing real works under an incorrect year. Of the 517 references that retained the form of a genuine journal article after three databases, exhaustive manual verification of the 101 most recent, and therefore highest-risk, survivors confirmed zero fabrications: every one was either a real work published outside the major indexes or a real work whose citation had been mangled beyond automatic recognition.</w:t>
+      </w:r>
+    </w:p>
+    <w:p>
+      <w:pPr>
+        <w:spacing w:after="140"/>
+        <w:jc w:val="both"/>
+      </w:pPr>
+      <w:r>
+        <w:rPr>
+          <w:b w:val="0"/>
+          <w:i w:val="0"/>
+          <w:sz w:val="22"/>
+        </w:rPr>
+        <w:t>On this evidence, fabricated references are a substantially smaller problem than unvalidated "not found" detection would suggest. What appears, on the surface, to be fabrication in the citation record is overwhelmingly real scholarship rendered invisible by indexing gaps and by citation matching that fails too readily, particularly for regional, non-English, and delisted journals. A credible screening tool, and a credible prevalence estimate, both depend on distinguishing these populations rather than conflating them, and any automated system that fails to make this distinction risks systematically penalising scholarship from already under-represented parts of the world.</w:t>
+      </w:r>
+    </w:p>
+    <w:p>
+      <w:pPr>
+        <w:spacing w:after="140"/>
+        <w:jc w:val="both"/>
+      </w:pPr>
+      <w:r>
+        <w:rPr>
+          <w:b w:val="0"/>
+          <w:i w:val="0"/>
+          <w:sz w:val="22"/>
+        </w:rPr>
+        <w:t>This study contributes a reproducible verification methodology, an operational taxonomy that separates fabrication from non-indexation and from matching failure, two incidental findings about the fragility of citation-matching and retraction-checking infrastructure, and a free, publicly deployed screening tool that operationalises this taxonomy for authors, editors, and reviewers. A properly powered, larger-scale prevalence estimate, together with an inter-annotator validation of the verification cascade itself, is identified as the natural next step for this line of research.</w:t>
       </w:r>
     </w:p>
     <w:p>
@@ -3021,62 +3049,16 @@
     </w:p>
     <w:p>
       <w:pPr>
-        <w:pStyle w:val="ListBullet"/>
-        <w:spacing w:after="80"/>
+        <w:spacing w:after="140"/>
+        <w:jc w:val="both"/>
       </w:pPr>
       <w:r>
         <w:rPr>
+          <w:b w:val="0"/>
+          <w:i w:val="0"/>
           <w:sz w:val="22"/>
         </w:rPr>
-        <w:t>Open-reference bias: journals that deposit open reference lists tend to be more procedurally rigorous, so the prevalence figures reported here constitute a lower bound on the wider literature.</w:t>
-      </w:r>
-    </w:p>
-    <w:p>
-      <w:pPr>
-        <w:pStyle w:val="ListBullet"/>
-        <w:spacing w:after="80"/>
-      </w:pPr>
-      <w:r>
-        <w:rPr>
-          <w:sz w:val="22"/>
-        </w:rPr>
-        <w:t>Matching bias: the matcher performs less well on non-Latin-script and author-only citations, inflating the ambiguous class.</w:t>
-      </w:r>
-    </w:p>
-    <w:p>
-      <w:pPr>
-        <w:pStyle w:val="ListBullet"/>
-        <w:spacing w:after="80"/>
-      </w:pPr>
-      <w:r>
-        <w:rPr>
-          <w:sz w:val="22"/>
-        </w:rPr>
-        <w:t>Sample size: with zero fabrications observed, only an upper bound on prevalence can be stated; a point estimate would require a substantially larger sample.</w:t>
-      </w:r>
-    </w:p>
-    <w:p>
-      <w:pPr>
-        <w:pStyle w:val="ListBullet"/>
-        <w:spacing w:after="80"/>
-      </w:pPr>
-      <w:r>
-        <w:rPr>
-          <w:sz w:val="22"/>
-        </w:rPr>
-        <w:t>No full-text parsing: this study relies on deposited reference strings rather than the full text of citing articles.</w:t>
-      </w:r>
-    </w:p>
-    <w:p>
-      <w:pPr>
-        <w:pStyle w:val="ListBullet"/>
-        <w:spacing w:after="80"/>
-      </w:pPr>
-      <w:r>
-        <w:rPr>
-          <w:sz w:val="22"/>
-        </w:rPr>
-        <w:t>Single-annotator verification: a stronger design would add a second, independent annotator and report inter-annotator agreement (see Section 2.5).</w:t>
+        <w:t>This study has five main limitations. First, an open-reference bias is likely present: journals that deposit open reference lists with Crossref tend to be more procedurally rigorous than the wider population of journals, so the prevalence figures reported here should be read as a lower bound on the literature as a whole rather than as representative of it. Second, the matching procedure carries a language and format bias, performing less well on non-Latin-script citations and on author-only citation styles; this inflates the size of the ambiguous class reported in Section 3.5 and may obscure genuine fabrication within it. Third, the sample size is a binding constraint on the strength of the central claim: with zero fabrications observed among the 101 manually verified survivors, only an upper bound on prevalence can be stated, and a genuine point estimate with a useful confidence interval would require a substantially larger sample, sufficient to observe positive cases. Fourth, the study relies exclusively on deposited reference strings rather than on the full text of citing articles, so citation practices that only become visible in context, such as in-text quotation accuracy, fall outside its scope. Fifth, the manual verification reported in Section 2.5 was conducted by a single annotator; a more rigorous design would add a second, independent annotator across a stratified sample of every verdict class and report inter-annotator agreement, from which the sensitivity and specificity of the automated cascade could be formally derived.</w:t>
       </w:r>
     </w:p>
     <w:p>

</xml_diff>

<commit_message>
Fix Table 3 wording and trim Discussion/Conclusion redundancy
Table 3's "Not verifiable" row previously mapped to "Non-indexed /
candidate fabrication" -- reintroducing, in a table a reader might
scan quickly, the exact not-found/fabricated conflation this paper
argues against. Reworded to "Non-indexed / unverified -- cause
unknown". Also trimmed a sentence in the Conclusion (Section 5) that
restated the same two-confounder framing already given in the opening
of the Discussion (Section 4), tightening the two sections.

Co-Authored-By: Claude Sonnet 5 <noreply@anthropic.com>
</commit_message>
<xml_diff>
--- a/Manuscrito_LearnedPublishing_v2.docx
+++ b/Manuscrito_LearnedPublishing_v2.docx
@@ -1566,7 +1566,7 @@
                 <w:b w:val="0"/>
                 <w:sz w:val="19"/>
               </w:rPr>
-              <w:t>Non-indexed / candidate fabrication</w:t>
+              <w:t>Non-indexed / unverified — cause unknown</w:t>
             </w:r>
           </w:p>
         </w:tc>
@@ -3084,7 +3084,7 @@
           <w:i w:val="0"/>
           <w:sz w:val="22"/>
         </w:rPr>
-        <w:t>On this evidence, fabricated references are a substantially smaller problem than unvalidated "not found" detection would suggest. What appears, on the surface, to be fabrication in the citation record is overwhelmingly real scholarship rendered invisible by indexing gaps and by citation matching that fails too readily, particularly for regional, non-English, and delisted journals. A credible screening tool, and a credible prevalence estimate, both depend on distinguishing these populations rather than conflating them, and any automated system that fails to make this distinction risks systematically penalising scholarship from already under-represented parts of the world.</w:t>
+        <w:t>On this evidence, fabricated references are a substantially smaller problem than unvalidated "not found" detection would suggest. A credible screening tool, and a credible prevalence estimate, both depend on distinguishing non-existence from invisibility rather than conflating them, and any automated system that fails to make this distinction risks systematically penalising scholarship from already under-represented parts of the world.</w:t>
       </w:r>
     </w:p>
     <w:p>

</xml_diff>

<commit_message>
Clarify Table 1's branching hierarchy and reword ambiguous row label
"of which article-shaped candidates" was unclear on its own reading;
reworded to "Article-shaped subset (of the 3,124 not verifiable)".
Also made the three derived rows (517, 96, 421) visually consistent:
same shading, progressive indentation, and a branch marker (↳)
distinct from the main funnel arrow (→), so the table reads as a
3,124 -> 517 -> {96, 421} branch rather than a single linear funnel.

Co-Authored-By: Claude Sonnet 5 <noreply@anthropic.com>
</commit_message>
<xml_diff>
--- a/Manuscrito_LearnedPublishing_v2.docx
+++ b/Manuscrito_LearnedPublishing_v2.docx
@@ -2059,10 +2059,10 @@
             <w:r/>
             <w:r>
               <w:rPr>
-                <w:b/>
+                <w:b w:val="0"/>
                 <w:sz w:val="19"/>
               </w:rPr>
-              <w:t xml:space="preserve">    of which article-shaped candidates</w:t>
+              <w:t xml:space="preserve">    ↳ Article-shaped subset (of the 3,124 not verifiable)</w:t>
             </w:r>
           </w:p>
         </w:tc>
@@ -2128,6 +2128,7 @@
         <w:tc>
           <w:tcPr>
             <w:tcW w:type="dxa" w:w="3600"/>
+            <w:shd w:val="clear" w:fill="EAF1FA"/>
           </w:tcPr>
           <w:p>
             <w:pPr>
@@ -2139,13 +2140,14 @@
                 <w:b w:val="0"/>
                 <w:sz w:val="19"/>
               </w:rPr>
-              <w:t>→ Found in Semantic Scholar (non-indexed)</w:t>
+              <w:t xml:space="preserve">        ↳ Found in Semantic Scholar (non-indexed)</w:t>
             </w:r>
           </w:p>
         </w:tc>
         <w:tc>
           <w:tcPr>
             <w:tcW w:type="dxa" w:w="1224"/>
+            <w:shd w:val="clear" w:fill="EAF1FA"/>
           </w:tcPr>
           <w:p>
             <w:pPr>
@@ -2164,6 +2166,7 @@
         <w:tc>
           <w:tcPr>
             <w:tcW w:type="dxa" w:w="1368"/>
+            <w:shd w:val="clear" w:fill="EAF1FA"/>
           </w:tcPr>
           <w:p>
             <w:pPr>
@@ -2182,6 +2185,7 @@
         <w:tc>
           <w:tcPr>
             <w:tcW w:type="dxa" w:w="3024"/>
+            <w:shd w:val="clear" w:fill="EAF1FA"/>
           </w:tcPr>
           <w:p>
             <w:pPr>
@@ -2214,7 +2218,7 @@
                 <w:b/>
                 <w:sz w:val="19"/>
               </w:rPr>
-              <w:t>→ Survivors of all four sources</w:t>
+              <w:t xml:space="preserve">        ↳ Survivors of all four sources</w:t>
             </w:r>
           </w:p>
         </w:tc>

</xml_diff>